<commit_message>
screenshots 폴더를 테스트와 같은 기준으로 정리(ai_test·team_self_test·user_test·work_process, 날짜 하위 폴더), README 현재 상태 반영
Co-Authored-By: Claude Opus 5.5 <noreply@anthropic.com>
Claude-Session: https://claude.ai/code/session_01Tvy22XgebarZmgvL1irgJL
</commit_message>
<xml_diff>
--- a/tests/team_self_test/오이소창원_최종자체테스트_체크리스트_20261003.docx
+++ b/tests/team_self_test/오이소창원_최종자체테스트_체크리스트_20261003.docx
@@ -44,7 +44,7 @@
         </w:rPr>
         <w:t xml:space="preserve"> 배포본 </w:t>
       </w:r>
-      <w:hyperlink w:history="1" r:id="rId5_a-wnd5tjle7obtrprye">
+      <w:hyperlink w:history="1" r:id="rIdyqjkhtnsezg2brip8fz2x">
         <w:r>
           <w:rPr>
             <w:rStyle w:val="Hyperlink"/>
@@ -618,7 +618,7 @@
                 <w:sz w:val="17"/>
                 <w:szCs w:val="17"/>
               </w:rPr>
-              <w:t xml:space="preserve">캡처는 문제 화면만, 파일명 이름_기기_항목번호.png (예: 이미영_폰_F-5.png)</w:t>
+              <w:t xml:space="preserve">캡처는 문제 화면만, 파일명 이름_기기_항목번호.png (예: 이미영_폰_F-5.png), 저장 위치 screenshots/team_self_test/</w:t>
             </w:r>
           </w:p>
         </w:tc>
@@ -11748,7 +11748,7 @@
               </w:rPr>
               <w:t xml:space="preserve">설문 링크(</w:t>
             </w:r>
-            <w:hyperlink w:history="1" r:id="rIdrzfhtezvtumirikmowcbi">
+            <w:hyperlink w:history="1" r:id="rIds76zoruzvwab58ltigohq">
               <w:r>
                 <w:rPr>
                   <w:rStyle w:val="Hyperlink"/>

</xml_diff>